<commit_message>
Justify proposal body text
Co-Authored-By: Claude Opus 5.5 <noreply@anthropic.com>
</commit_message>
<xml_diff>
--- a/docs/proposal/AI_Travel_Planner_Proposal.docx
+++ b/docs/proposal/AI_Travel_Planner_Proposal.docx
@@ -59,6 +59,7 @@
       <w:pPr>
         <w:pStyle w:val="BodyText"/>
         <w:spacing w:after="40" w:before="0" w:line="240" w:lineRule="auto"/>
+        <w:jc w:val="both"/>
       </w:pPr>
       <w:r>
         <w:rPr>
@@ -123,6 +124,7 @@
       <w:pPr>
         <w:pStyle w:val="BodyText"/>
         <w:spacing w:after="40" w:before="0" w:line="240" w:lineRule="auto"/>
+        <w:jc w:val="both"/>
       </w:pPr>
       <w:r>
         <w:rPr>
@@ -294,6 +296,7 @@
       <w:pPr>
         <w:pStyle w:val="BodyText"/>
         <w:spacing w:after="40" w:before="0" w:line="240" w:lineRule="auto"/>
+        <w:jc w:val="both"/>
       </w:pPr>
       <w:r>
         <w:rPr>
@@ -390,6 +393,7 @@
       <w:pPr>
         <w:pStyle w:val="BodyText"/>
         <w:spacing w:after="30" w:before="0" w:line="240" w:lineRule="auto"/>
+        <w:jc w:val="both"/>
       </w:pPr>
       <w:r>
         <w:rPr>
@@ -858,12 +862,14 @@
       <w:pPr>
         <w:pStyle w:val="BodyText"/>
         <w:spacing w:after="0" w:before="0" w:line="120" w:lineRule="exact"/>
+        <w:jc w:val="both"/>
       </w:pPr>
     </w:p>
     <w:p>
       <w:pPr>
         <w:pStyle w:val="BodyText"/>
         <w:spacing w:after="40" w:before="0" w:line="240" w:lineRule="auto"/>
+        <w:jc w:val="both"/>
       </w:pPr>
       <w:r>
         <w:rPr>
@@ -913,6 +919,7 @@
       <w:pPr>
         <w:pStyle w:val="BodyText"/>
         <w:spacing w:after="40" w:before="0" w:line="240" w:lineRule="auto"/>
+        <w:jc w:val="both"/>
       </w:pPr>
       <w:r>
         <w:rPr>
@@ -934,6 +941,7 @@
       <w:pPr>
         <w:pStyle w:val="BodyText"/>
         <w:spacing w:after="40" w:before="0" w:line="240" w:lineRule="auto"/>
+        <w:jc w:val="both"/>
       </w:pPr>
       <w:r>
         <w:rPr>
@@ -968,6 +976,7 @@
       <w:pPr>
         <w:pStyle w:val="BodyText"/>
         <w:spacing w:after="30" w:before="0" w:line="240" w:lineRule="auto"/>
+        <w:jc w:val="both"/>
       </w:pPr>
       <w:r>
         <w:rPr>
@@ -1875,6 +1884,7 @@
       <w:pPr>
         <w:pStyle w:val="BodyText"/>
         <w:spacing w:after="0" w:before="0" w:line="120" w:lineRule="exact"/>
+        <w:jc w:val="both"/>
       </w:pPr>
     </w:p>
     <w:p>
@@ -1894,6 +1904,7 @@
       <w:pPr>
         <w:pStyle w:val="BodyText"/>
         <w:spacing w:after="40" w:before="0" w:line="240" w:lineRule="auto"/>
+        <w:jc w:val="both"/>
       </w:pPr>
       <w:r>
         <w:rPr>
@@ -1945,6 +1956,7 @@
       <w:pPr>
         <w:pStyle w:val="BodyText"/>
         <w:spacing w:after="40" w:before="0" w:line="240" w:lineRule="auto"/>
+        <w:jc w:val="both"/>
       </w:pPr>
       <w:r>
         <w:rPr>
@@ -2009,6 +2021,7 @@
       <w:pPr>
         <w:pStyle w:val="BodyText"/>
         <w:spacing w:after="30" w:before="0" w:line="240" w:lineRule="auto"/>
+        <w:jc w:val="both"/>
       </w:pPr>
       <w:r>
         <w:rPr>
@@ -2592,6 +2605,7 @@
       <w:pPr>
         <w:pStyle w:val="BodyText"/>
         <w:spacing w:after="0" w:before="0" w:line="20" w:lineRule="exact"/>
+        <w:jc w:val="both"/>
         <w:rPr>
           <w:sz w:val="2"/>
           <w:szCs w:val="2"/>

</xml_diff>

<commit_message>
Update PA#1 proposal to final submission
</commit_message>
<xml_diff>
--- a/docs/proposal/AI_Travel_Planner_Proposal.docx
+++ b/docs/proposal/AI_Travel_Planner_Proposal.docx
@@ -59,7 +59,6 @@
       <w:pPr>
         <w:pStyle w:val="BodyText"/>
         <w:spacing w:after="40" w:before="0" w:line="240" w:lineRule="auto"/>
-        <w:jc w:val="both"/>
       </w:pPr>
       <w:r>
         <w:rPr>
@@ -74,7 +73,7 @@
           <w:sz w:val="19"/>
           <w:szCs w:val="19"/>
         </w:rPr>
-        <w:t xml:space="preserve"> Linh, 20 tuổi, sinh viên ở Cần Thơ, lên TP.HCM chơi 2 ngày cuối tuần cùng 3 bạn; ngân sách khoảng 1 triệu đồng/người cho ăn uống và vé, chưa tính chỗ ở và tiền đi lại; đi Grab và xe máy. Cả ba thành viên từng ở đúng tình huống này năm nhất. </w:t>
+        <w:t xml:space="preserve"> Linh, 20 tuổi, sinh viên ở Cần Thơ, lên TP.HCM chơi 2 ngày cuối tuần cùng 3 bạn; ngân sách khoảng 1 triệu đồng/người chưa tính chỗ ở; đi Grab và xe máy. Linh là hình ảnh của chính nhóm: cả ba thành viên đều gặp đúng tình huống này năm nhất, khi mới lên Sài Gòn học và rủ nhau đi chơi lần đầu. </w:t>
       </w:r>
       <w:r>
         <w:rPr>
@@ -82,14 +81,14 @@
           <w:sz w:val="19"/>
           <w:szCs w:val="19"/>
         </w:rPr>
-        <w:t xml:space="preserve">Vấn đề, trong một câu:</w:t>
-      </w:r>
-      <w:r>
-        <w:rPr>
-          <w:sz w:val="19"/>
-          <w:szCs w:val="19"/>
-        </w:rPr>
-        <w:t xml:space="preserve"> lịch nhóm Linh tự ghép đưa cả 4 người tới quán đóng cửa, điểm quá xa nhau hoặc lố ngân sách, và họ chỉ biết khi đã ở ngoài đường. </w:t>
+        <w:t xml:space="preserve">Vấn đề:</w:t>
+      </w:r>
+      <w:r>
+        <w:rPr>
+          <w:sz w:val="19"/>
+          <w:szCs w:val="19"/>
+        </w:rPr>
+        <w:t xml:space="preserve"> nhóm của Linh mất cả buổi tối ghép lịch từ video TikTok và ghim Google Maps, nhưng vẫn đến nơi đang đóng cửa, chạy qua lại giữa các quận, tiêu lố ngân sách, hoặc kẹt mưa chiều ở điểm ngoài trời. </w:t>
       </w:r>
       <w:r>
         <w:rPr>
@@ -104,7 +103,7 @@
           <w:sz w:val="19"/>
           <w:szCs w:val="19"/>
         </w:rPr>
-        <w:t xml:space="preserve"> mất cả buổi tối lưu video TikTok, ghim Google Maps, hỏi giá qua fanpage, rồi một người gõ lịch vào Notes gửi Zalo; không ai kiểm tra giờ mở cửa, khoảng cách, tổng tiền hay dự báo mưa. Hỏi ChatGPT không giải quyết được: nó không biết giờ mở cửa và giá hiện tại của quán nhỏ ở TP.HCM, không cộng được ngân sách cho nhóm có mức chi khác nhau, và không có gì chặn lại khi nó bịa địa điểm.</w:t>
+        <w:t xml:space="preserve"> lưu video TikTok, ghim Google Maps, hỏi giá qua fanpage, rồi một người gõ lịch vào Notes gửi Zalo; không ai kiểm tra giờ mở cửa, khoảng cách, tổng tiền hay dự báo mưa, và đổi ý là phải gửi lại cả danh sách. Hỏi ChatGPT không giải quyết được: nó không biết giờ mở cửa và giá hiện tại của quán nhỏ ở TP.HCM, không cộng được ngân sách cho nhóm có mức chi khác nhau, và không có gì chặn lại khi nó bịa địa điểm.</w:t>
       </w:r>
     </w:p>
     <w:p>
@@ -124,7 +123,6 @@
       <w:pPr>
         <w:pStyle w:val="BodyText"/>
         <w:spacing w:after="40" w:before="0" w:line="240" w:lineRule="auto"/>
-        <w:jc w:val="both"/>
       </w:pPr>
       <w:r>
         <w:rPr>
@@ -296,7 +294,6 @@
       <w:pPr>
         <w:pStyle w:val="BodyText"/>
         <w:spacing w:after="40" w:before="0" w:line="240" w:lineRule="auto"/>
-        <w:jc w:val="both"/>
       </w:pPr>
       <w:r>
         <w:rPr>
@@ -393,7 +390,6 @@
       <w:pPr>
         <w:pStyle w:val="BodyText"/>
         <w:spacing w:after="30" w:before="0" w:line="240" w:lineRule="auto"/>
-        <w:jc w:val="both"/>
       </w:pPr>
       <w:r>
         <w:rPr>
@@ -462,7 +458,7 @@
                 <w:sz w:val="17"/>
                 <w:szCs w:val="17"/>
               </w:rPr>
-              <w:t xml:space="preserve">Lỗi</w:t>
+              <w:t xml:space="preserve">Lỗi của Agent</w:t>
             </w:r>
           </w:p>
         </w:tc>
@@ -714,7 +710,7 @@
                 <w:sz w:val="17"/>
                 <w:szCs w:val="17"/>
               </w:rPr>
-              <w:t xml:space="preserve">LLM chấm sai độ phù hợp hoặc bịa lý do (ghi "có món chay" khi menu không có)</w:t>
+              <w:t xml:space="preserve">Chấm sai độ phù hợp: đề xuất điểm không ai thích hoặc chỉ hợp một người</w:t>
             </w:r>
           </w:p>
         </w:tc>
@@ -733,7 +729,7 @@
                 <w:sz w:val="17"/>
                 <w:szCs w:val="17"/>
               </w:rPr>
-              <w:t xml:space="preserve">Thành viên có sở thích ít người chung, vd. 1 người ăn chay</w:t>
+              <w:t xml:space="preserve">Cả nhóm, nhất là người bị bỏ qua</w:t>
             </w:r>
           </w:p>
         </w:tc>
@@ -752,7 +748,7 @@
                 <w:sz w:val="17"/>
                 <w:szCs w:val="17"/>
               </w:rPr>
-              <w:t xml:space="preserve">Đến quán không có món ăn được: mất 1 bữa và 50–100k mua thêm. Tần suất đo ở CP4 trên bộ 30 ca</w:t>
+              <w:t xml:space="preserve">Mất thời gian chọn lại; nếu không ai để ý, cả ngày đi những điểm nhạt</w:t>
             </w:r>
           </w:p>
         </w:tc>
@@ -771,7 +767,7 @@
                 <w:sz w:val="17"/>
                 <w:szCs w:val="17"/>
               </w:rPr>
-              <w:t xml:space="preserve">Có, ở bước 3 (bỏ, ghim điểm). Code đối chiếu món trong lý do với get_menu, chặn trước khi hiện</w:t>
+              <w:t xml:space="preserve">Có. Bước 3 cho bỏ hoặc ghim điểm trước khi dựng lịch</w:t>
             </w:r>
           </w:p>
         </w:tc>
@@ -795,7 +791,7 @@
                 <w:sz w:val="17"/>
                 <w:szCs w:val="17"/>
               </w:rPr>
-              <w:t xml:space="preserve">Lỗi dữ liệu, không phải LLM: giá menu đã cũ, kế hoạch báo thấp hơn thực tế</w:t>
+              <w:t xml:space="preserve">Giá menu trong dữ liệu đã cũ, kế hoạch báo thấp hơn thực tế</w:t>
             </w:r>
           </w:p>
         </w:tc>
@@ -862,14 +858,12 @@
       <w:pPr>
         <w:pStyle w:val="BodyText"/>
         <w:spacing w:after="0" w:before="0" w:line="120" w:lineRule="exact"/>
-        <w:jc w:val="both"/>
       </w:pPr>
     </w:p>
     <w:p>
       <w:pPr>
         <w:pStyle w:val="BodyText"/>
         <w:spacing w:after="40" w:before="0" w:line="240" w:lineRule="auto"/>
-        <w:jc w:val="both"/>
       </w:pPr>
       <w:r>
         <w:rPr>
@@ -884,7 +878,7 @@
           <w:sz w:val="19"/>
           <w:szCs w:val="19"/>
         </w:rPr>
-        <w:t xml:space="preserve"> log từng lượt chạy (tool đã gọi, số vòng sửa, vi phạm bị chặn); nút "Điểm này có vấn đề" (đóng cửa, sai giá, quá xa, không hợp) trên từng điểm; bộ 30 yêu cầu mẫu có ràng buộc biết trước, dùng lại cho PA#4; so sánh thủ công và Agent trên 10 yêu cầu (3 người làm tay mỗi yêu cầu): thời gian tới lịch không lỗi, số vi phạm, % ngân sách, điểm phù hợp 1–5. </w:t>
+        <w:t xml:space="preserve"> log từng lượt chạy (tool đã gọi, số vòng sửa, vi phạm bị chặn); nút "Điểm này có vấn đề" (đóng cửa, sai giá, quá xa, không hợp) trên từng điểm; bộ 30 yêu cầu mẫu có ràng buộc biết trước, dùng lại cho PA#4; so sánh thủ công và Agent trên 10 yêu cầu, mỗi yêu cầu 3 người làm tay, đo thời gian tới khi lưu được lịch không lỗi, số vi phạm, phần trăm ngân sách dùng, điểm phù hợp tự chấm 1–5. </w:t>
       </w:r>
       <w:r>
         <w:rPr>
@@ -899,7 +893,7 @@
           <w:sz w:val="19"/>
           <w:szCs w:val="19"/>
         </w:rPr>
-        <w:t xml:space="preserve"> gọi tool đúng cấu trúc từ 80%; không lịch nào vượt trần chi sau validator; p90 dưới 60 giây; thời gian tới lịch không lỗi giảm ít nhất một nửa so với làm tay. Validator chặn bằng code dòng 1–2 khi dữ liệu đúng; hại còn lại sau validator là dòng 3 (lỗi của LLM) và dòng 4 (lỗi dữ liệu). Dòng 3 đo trên 30 ca: % lý do nhắc món không có trong get_menu (code đếm, mục tiêu 0% sau khi chặn) và điểm 1–5 của từng thành viên (mục tiêu ai cũng có ít nhất 2 điểm từ 4). Dòng 4 đo bằng số lần bấm "sai giá" mỗi chuyến. Đây là tính năng LLM duy nhất.</w:t>
+        <w:t xml:space="preserve"> gọi tool đúng cấu trúc từ 80%; không lịch nào vượt trần chi sau validator; p90 dưới 60 giây; thời gian tới lịch không lỗi giảm ít nhất một nửa so với làm tay. Tính năng AI phụ (chấm điểm bạn đồng hành) dùng chung hạ tầng và bị cắt trước nếu thiếu thời gian.</w:t>
       </w:r>
     </w:p>
     <w:p>
@@ -919,7 +913,6 @@
       <w:pPr>
         <w:pStyle w:val="BodyText"/>
         <w:spacing w:after="40" w:before="0" w:line="240" w:lineRule="auto"/>
-        <w:jc w:val="both"/>
       </w:pPr>
       <w:r>
         <w:rPr>
@@ -934,14 +927,13 @@
           <w:sz w:val="19"/>
           <w:szCs w:val="19"/>
         </w:rPr>
-        <w:t xml:space="preserve"> (CP = mốc hoàn thành): dữ liệu 150 địa điểm và menu kiểm tra tay (CP1, CP2); đăng nhập và hồ sơ sở thích (CP2); tìm kiếm địa điểm TP.HCM theo loại, quận, đang mở, mức giá và trang chi tiết với bản đồ, menu, mô tả Wikipedia và ảnh Commons nạp sẵn một lần (không có bài thì dùng mô tả trong Sheet) (CP3); sổ địa điểm muốn đi và đã đi (đầu vào get_profile để Agent không xếp lại điểm đã đi) (CP3); nhóm với tổng tiền và trần chi từng người (CP3); thời tiết và ngày lễ làm đầu vào cho Agent (CP3); lịch trình và chi tiêu cho cá nhân hoặc nhóm theo hai chế độ ở mục 2 (CP4); nhóm cùng sửa một lịch, nút báo lỗi điểm, dashboard log (CP5).</w:t>
+        <w:t xml:space="preserve"> (CP = mốc hoàn thành): dữ liệu 150 địa điểm và menu kiểm tra tay (CP1, CP2); đăng nhập và hồ sơ sở thích (CP2); tìm kiếm địa điểm TP.HCM theo loại, quận, đang mở, mức giá và trang chi tiết với Wikipedia, ảnh Commons, bản đồ, menu (CP3); sổ địa điểm muốn đi và đã đi qua check-in, bản đồ đã đi (CP3); nhóm với tổng tiền và trần chi từng người (CP3); thời tiết và ngày lễ làm đầu vào cho Agent (CP3); lịch trình và chi tiêu cho cá nhân hoặc nhóm theo hai chế độ ở mục 2 (CP4); review 1–5 sao chỉ sau check-in (CP3); nhóm cùng sửa một lịch (CP5); bài đăng khoảnh khắc và bài quảng bá của tài khoản doanh nghiệp được admin duyệt, like, bình luận (CP5); tìm bạn đồng hành có AI chấm điểm, chỉ người bật công khai, có chặn và báo cáo (CP5).</w:t>
       </w:r>
     </w:p>
     <w:p>
       <w:pPr>
         <w:pStyle w:val="BodyText"/>
         <w:spacing w:after="40" w:before="0" w:line="240" w:lineRule="auto"/>
-        <w:jc w:val="both"/>
       </w:pPr>
       <w:r>
         <w:rPr>
@@ -956,7 +948,7 @@
           <w:sz w:val="19"/>
           <w:szCs w:val="19"/>
         </w:rPr>
-        <w:t xml:space="preserve"> đặt vé, đặt phòng, thanh toán, chia tiền (chi tiêu chỉ là ước tính); bài đăng, like, bình luận, review sao, bản đồ đã đi; tài khoản doanh nghiệp, bài quảng bá và quảng cáo; tìm bạn đồng hành; mọi tính năng AI khác ngoài Agent; nhắn tin riêng, chat và vị trí thời gian thực; bảng tin cá nhân hoá; địa điểm ngoài TP.HCM và ứng dụng di động native; chatbot hỏi đáp tự do; gọi API địa điểm lúc tạo lịch (chỉ nạp dữ liệu một lần); ảnh và review Google Places; chỉ đường từng bước; ước tính tiền Grab hay xăng.</w:t>
+        <w:t xml:space="preserve"> đặt vé, đặt phòng, thanh toán, chia tiền (chi tiêu chỉ là ước tính); thu phí quảng cáo và bài quảng bá không ảnh hưởng tới lịch của Agent; nhắn tin riêng, chat và vị trí thời gian thực; bảng tin cá nhân hoá; địa điểm ngoài TP.HCM và ứng dụng di động native; chatbot hỏi đáp tự do; gọi API địa điểm lúc tạo lịch (Geoapify, Wikivoyage chỉ dùng để nạp dữ liệu một lần, lịch chỉ dựa trên 150 điểm đã kiểm tra tay); ảnh và review Google Places (cần thẻ tín dụng); chỉ đường từng bước; ước tính tiền Grab hay xăng.</w:t>
       </w:r>
     </w:p>
     <w:p>
@@ -976,14 +968,13 @@
       <w:pPr>
         <w:pStyle w:val="BodyText"/>
         <w:spacing w:after="30" w:before="0" w:line="240" w:lineRule="auto"/>
-        <w:jc w:val="both"/>
-      </w:pPr>
-      <w:r>
-        <w:rPr>
-          <w:sz w:val="19"/>
-          <w:szCs w:val="19"/>
-        </w:rPr>
-        <w:t xml:space="preserve">CP1–CP6 khớp lần lượt với sáu checkpoint của môn; nhóm tự đặt hạn sớm hơn (26/10 đến 25/11, cách nhau 6 ngày) để luôn có đệm trước hạn môn và dành phần còn lại của học kỳ cho đánh giá PA#4 và sửa theo góp ý: IA#1 nộp ở CP2, spec tính năng lõi ở CP3, bộ 30 ca cho PA#4 xong ở CP4. Đường găng: dữ liệu 150 điểm và menu có giá (Duy), rồi ma trận Valhalla (Duy), rồi Agent (Đạt); trễ một mắt xích thì CP4 trễ theo. Mỗi việc là một issue trên GitHub Projects.</w:t>
+      </w:pPr>
+      <w:r>
+        <w:rPr>
+          <w:sz w:val="19"/>
+          <w:szCs w:val="19"/>
+        </w:rPr>
+        <w:t xml:space="preserve">Nhóm đặt mục tiêu hoàn thành đồ án trong một tháng, từ 26/10 đến 25/11, nên sáu checkpoint cách nhau 6 ngày; đây là lịch nhóm tự ràng buộc, nằm trước hạn của môn. Đường găng: dữ liệu 150 điểm và menu có giá (Duy), rồi ma trận Valhalla (Duy), rồi Agent (Đạt); trễ một mắt xích thì CP4 trễ theo. Mỗi việc là một issue trên GitHub Projects; họp 30 phút đầu mỗi chặng để rà điều kiện đạt của CP kế tiếp.</w:t>
       </w:r>
     </w:p>
     <w:tbl>
@@ -1165,7 +1156,7 @@
                 <w:sz w:val="17"/>
                 <w:szCs w:val="17"/>
               </w:rPr>
-              <w:t xml:space="preserve">Repo, CI lint và test, deploy api lên Render (</w:t>
+              <w:t xml:space="preserve">Proposal, repo, CI lint và test, deploy thử web lên Vercel và api lên Render (</w:t>
             </w:r>
             <w:r>
               <w:rPr>
@@ -1180,7 +1171,7 @@
                 <w:sz w:val="17"/>
                 <w:szCs w:val="17"/>
               </w:rPr>
-              <w:t xml:space="preserve">). Script nạp Geoapify và Wikivoyage ra Google Sheet, chọn 150 điểm; kiểm tra tay 25 điểm (</w:t>
+              <w:t xml:space="preserve">). Script nạp Geoapify và Wikivoyage ra Google Sheet, chọn 150 điểm, mỗi người kiểm tra tay 50 điểm (</w:t>
             </w:r>
             <w:r>
               <w:rPr>
@@ -1195,7 +1186,7 @@
                 <w:sz w:val="17"/>
                 <w:szCs w:val="17"/>
               </w:rPr>
-              <w:t xml:space="preserve">). Kiểm tra tay 25 điểm; khởi tạo Next.js và Firebase, deploy web lên Vercel (</w:t>
+              <w:t xml:space="preserve">). Khởi tạo Next.js và Firebase, proxy bản đồ và geocode, MapLibre hiện 150 điểm (</w:t>
             </w:r>
             <w:r>
               <w:rPr>
@@ -1210,7 +1201,7 @@
                 <w:sz w:val="17"/>
                 <w:szCs w:val="17"/>
               </w:rPr>
-              <w:t xml:space="preserve">). Kiểm tra tay 25 điểm; spike Qwen 2.5 7B và Qwen3 8B trên máy demo với 10 ca, chấm cả câu lý do tiếng Việt (</w:t>
+              <w:t xml:space="preserve">). Spike Qwen 2.5 7B và Qwen3 8B trên máy demo với 10 ca (</w:t>
             </w:r>
             <w:r>
               <w:rPr>
@@ -1244,7 +1235,7 @@
                 <w:sz w:val="17"/>
                 <w:szCs w:val="17"/>
               </w:rPr>
-              <w:t xml:space="preserve">Sheet 150 điểm có giờ mở, nguồn; ít nhất 75 điểm đã kiểm tra tay (khoảng 5 phút/điểm); web và api deploy, web đọc được Firestore; có số đo spike trên Qwen và Gemini</w:t>
+              <w:t xml:space="preserve">Sheet đủ 150 điểm có giờ mở, nguồn, ngày kiểm tra; web và api deploy thành công; có số đo spike trên Qwen và Gemini</w:t>
             </w:r>
           </w:p>
         </w:tc>
@@ -1306,7 +1297,7 @@
                 <w:sz w:val="17"/>
                 <w:szCs w:val="17"/>
               </w:rPr>
-              <w:t xml:space="preserve">IA#1 (spec) theo quy định môn; thiết kế các collection Firestore (</w:t>
+              <w:t xml:space="preserve">Spec IA#1, thiết kế các collection Firestore (</w:t>
             </w:r>
             <w:r>
               <w:rPr>
@@ -1321,7 +1312,7 @@
                 <w:sz w:val="17"/>
                 <w:szCs w:val="17"/>
               </w:rPr>
-              <w:t xml:space="preserve">). Đăng nhập, hồ sơ sở thích, MapLibre hiện 150 điểm qua proxy bản đồ (</w:t>
+              <w:t xml:space="preserve">). Đăng nhập và hồ sơ sở thích (</w:t>
             </w:r>
             <w:r>
               <w:rPr>
@@ -1336,7 +1327,7 @@
                 <w:sz w:val="17"/>
                 <w:szCs w:val="17"/>
               </w:rPr>
-              <w:t xml:space="preserve">). Ma trận xe máy Valhalla 150×150, OSRM dự phòng; menu và giá cho 150 điểm, có nguồn và ngày kiểm tra; nạp sẵn mô tả Wikipedia, ảnh Commons (</w:t>
+              <w:t xml:space="preserve">). Ma trận xe máy Valhalla 150×150, OSRM dự phòng; menu và giá cho 150 điểm, có nguồn và ngày kiểm tra (</w:t>
             </w:r>
             <w:r>
               <w:rPr>
@@ -1370,7 +1361,7 @@
                 <w:sz w:val="17"/>
                 <w:szCs w:val="17"/>
               </w:rPr>
-              <w:t xml:space="preserve">Nộp IA#1; 150/150 điểm kiểm tra tay (mỗi người thêm 25); ma trận đủ 22.350 cặp; mọi điểm có từ 3 mục menu; đăng nhập chạy trên bản deploy</w:t>
+              <w:t xml:space="preserve">Nộp IA#1; ma trận đủ 22.350 cặp; mọi điểm có từ 3 mục menu; đăng nhập chạy trên bản deploy</w:t>
             </w:r>
           </w:p>
         </w:tc>
@@ -1447,7 +1438,7 @@
                 <w:sz w:val="17"/>
                 <w:szCs w:val="17"/>
               </w:rPr>
-              <w:t xml:space="preserve">). Sổ địa điểm muốn đi, đã đi; Open-Meteo và Nager.Date (</w:t>
+              <w:t xml:space="preserve">). Sổ địa điểm, review sau check-in, Open-Meteo và Nager.Date (</w:t>
             </w:r>
             <w:r>
               <w:rPr>
@@ -1684,7 +1675,7 @@
                 <w:sz w:val="17"/>
                 <w:szCs w:val="17"/>
               </w:rPr>
-              <w:t xml:space="preserve">Giao diện nhóm cùng sửa lịch, hiện ai đang sửa; nút báo lỗi điểm (</w:t>
+              <w:t xml:space="preserve">Bài đăng, like, bình luận, ảnh qua Cloudinary (</w:t>
             </w:r>
             <w:r>
               <w:rPr>
@@ -1699,7 +1690,7 @@
                 <w:sz w:val="17"/>
                 <w:szCs w:val="17"/>
               </w:rPr>
-              <w:t xml:space="preserve">). Đồng bộ và chống ghi đè bằng version và transaction; dashboard log (</w:t>
+              <w:t xml:space="preserve">). Nhóm sửa đồng thời; nút báo lỗi điểm; dashboard log (</w:t>
             </w:r>
             <w:r>
               <w:rPr>
@@ -1714,7 +1705,7 @@
                 <w:sz w:val="17"/>
                 <w:szCs w:val="17"/>
               </w:rPr>
-              <w:t xml:space="preserve">). Báo cáo đo chất lượng Agent, gồm điểm phù hợp từng thành viên (</w:t>
+              <w:t xml:space="preserve">). Bạn đồng hành có AI chấm; báo cáo đo chất lượng Agent (</w:t>
             </w:r>
             <w:r>
               <w:rPr>
@@ -1748,7 +1739,7 @@
                 <w:sz w:val="17"/>
                 <w:szCs w:val="17"/>
               </w:rPr>
-              <w:t xml:space="preserve">Hai tài khoản sửa cùng lịch không ghi đè; có số liệu thủ công với Agent trên 10 ca. Thiếu thời gian thì cắt sửa đồng thời, chỉ người tạo được sửa</w:t>
+              <w:t xml:space="preserve">Hai tài khoản sửa cùng lịch không ghi đè; có số liệu thủ công với Agent trên 10 ca. Thiếu thời gian thì cắt: bài quảng bá, rồi AI bạn đồng hành, rồi sửa đồng thời</w:t>
             </w:r>
           </w:p>
         </w:tc>
@@ -1884,7 +1875,6 @@
       <w:pPr>
         <w:pStyle w:val="BodyText"/>
         <w:spacing w:after="0" w:before="0" w:line="120" w:lineRule="exact"/>
-        <w:jc w:val="both"/>
       </w:pPr>
     </w:p>
     <w:p>
@@ -1904,7 +1894,6 @@
       <w:pPr>
         <w:pStyle w:val="BodyText"/>
         <w:spacing w:after="40" w:before="0" w:line="240" w:lineRule="auto"/>
-        <w:jc w:val="both"/>
       </w:pPr>
       <w:r>
         <w:rPr>
@@ -1949,14 +1938,13 @@
           <w:sz w:val="19"/>
           <w:szCs w:val="19"/>
         </w:rPr>
-        <w:t xml:space="preserve"> giới hạn cứng 150 điểm; điểm thiếu giờ mở hoặc menu không được làm ứng viên; điểm có ngày kiểm tra quá 30 ngày bị gắn nhãn "giá có thể cũ" trên lịch và được kiểm tra lại trước demo. Ngày đầu tuần chạy lại phép đo độ phủ trên dữ liệu TP.HCM.</w:t>
+        <w:t xml:space="preserve"> giới hạn cứng 150 điểm; điểm thiếu giờ mở hoặc menu không được làm ứng viên.</w:t>
       </w:r>
     </w:p>
     <w:p>
       <w:pPr>
         <w:pStyle w:val="BodyText"/>
         <w:spacing w:after="40" w:before="0" w:line="240" w:lineRule="auto"/>
-        <w:jc w:val="both"/>
       </w:pPr>
       <w:r>
         <w:rPr>
@@ -2021,7 +2009,6 @@
       <w:pPr>
         <w:pStyle w:val="BodyText"/>
         <w:spacing w:after="30" w:before="0" w:line="240" w:lineRule="auto"/>
-        <w:jc w:val="both"/>
       </w:pPr>
       <w:r>
         <w:rPr>
@@ -2105,6 +2092,21 @@
         </w:rPr>
         <w:t xml:space="preserve"> · </w:t>
       </w:r>
+      <w:hyperlink r:id="rId34">
+        <w:r>
+          <w:rPr>
+            <w:rStyle w:val="Hyperlink"/>
+            <w:sz w:val="19"/>
+          </w:rPr>
+          <w:t xml:space="preserve">Cloudinary</w:t>
+        </w:r>
+      </w:hyperlink>
+      <w:r>
+        <w:rPr>
+          <w:sz w:val="19"/>
+        </w:rPr>
+        <w:t xml:space="preserve"> · </w:t>
+      </w:r>
       <w:hyperlink r:id="rId35">
         <w:r>
           <w:rPr>
@@ -2119,7 +2121,7 @@
           <w:sz w:val="19"/>
           <w:szCs w:val="19"/>
         </w:rPr>
-        <w:t xml:space="preserve">. Proposal lưu trong repo tại </w:t>
+        <w:t xml:space="preserve">. Bản đầy đủ (sơ đồ luồng Agent, Gantt, kiến trúc, mô hình dữ liệu, bảo mật) nằm trong repo tại </w:t>
       </w:r>
       <w:r>
         <w:rPr>
@@ -2127,7 +2129,7 @@
           <w:sz w:val="19"/>
           <w:szCs w:val="19"/>
         </w:rPr>
-        <w:t xml:space="preserve">docs/proposal/</w:t>
+        <w:t xml:space="preserve">docs/proposal-full.docx</w:t>
       </w:r>
       <w:r>
         <w:rPr>
@@ -2232,7 +2234,7 @@
                 <w:sz w:val="17"/>
                 <w:szCs w:val="17"/>
               </w:rPr>
-              <w:t xml:space="preserve">Qwen 2.5 7B hoặc Qwen3 8B (bản thắng spike CP1) qua Ollama, nối Render bằng Cloudflare Tunnel</w:t>
+              <w:t xml:space="preserve">Qwen 2.5 7B qua Ollama trên máy demo, nối với Render qua Cloudflare Tunnel (model chính)</w:t>
             </w:r>
           </w:p>
         </w:tc>
@@ -2251,7 +2253,7 @@
                 <w:sz w:val="17"/>
                 <w:szCs w:val="17"/>
               </w:rPr>
-              <w:t xml:space="preserve">Không giới hạn lượt gọi nên chạy bộ 30 ca nhiều lần cho PA#4; chọn bản có tool đúng từ 80%, p90 dưới 60 giây, tiếng Việt đọc được. 0 đồng, máy 8 GB RAM (của Đạt)</w:t>
+              <w:t xml:space="preserve">Open-weight, không giới hạn lượt gọi nên chạy bộ 30 ca nhiều lần cho PA#4; hỗ trợ gọi tool và JSON theo schema; dữ liệu người dùng không ra ngoài; Tunnel cho URL HTTPS cố định kèm token chặn dùng ké. 0 đồng, cần máy từ 8 GB RAM (máy của Đạt)</w:t>
             </w:r>
           </w:p>
         </w:tc>
@@ -2294,7 +2296,7 @@
                 <w:sz w:val="17"/>
                 <w:szCs w:val="17"/>
               </w:rPr>
-              <w:t xml:space="preserve">Gọi cùng 7 tool khi máy Ollama tắt; free tier 0 đồng, trả phí $0.30 / $2.50 mỗi 1M token vào / ra (ai.google.dev/gemini-api/docs/pricing), khoảng $0.02 mỗi lượt</w:t>
+              <w:t xml:space="preserve">Function calling cho cùng 7 tool khi máy Ollama tắt; free tier 0 đồng, trả phí $0.30 / 1M token vào và $2.50 / 1M token ra, khoảng $0.02 mỗi lượt Agent; chỉ gửi địa điểm và sở thích, không gửi tên, email</w:t>
             </w:r>
           </w:p>
         </w:tc>
@@ -2380,7 +2382,7 @@
                 <w:sz w:val="17"/>
                 <w:szCs w:val="17"/>
               </w:rPr>
-              <w:t xml:space="preserve">Vòng Agent kéo dài hàng chục giây nên cần process chạy liên tục thay vì serverless; là cổng duy nhất ra dịch vụ ngoài, giữ mọi key. 0 đồng, 750 giờ/tháng, ngủ sau 15 phút, nên ping 10 phút một lần trong lúc chạy bộ đo và demo để p90 không tính thời gian khởi động</w:t>
+              <w:t xml:space="preserve">Vòng Agent kéo dài hàng chục giây nên cần process chạy liên tục thay vì serverless; là cổng duy nhất ra dịch vụ ngoài, giữ mọi key. 0 đồng, 750 giờ/tháng, ngủ sau 15 phút</w:t>
             </w:r>
           </w:p>
         </w:tc>
@@ -2447,7 +2449,7 @@
                 <w:sz w:val="17"/>
                 <w:szCs w:val="17"/>
               </w:rPr>
-              <w:t xml:space="preserve">Zod, Vitest, GitHub Actions</w:t>
+              <w:t xml:space="preserve">Cloudinary (free)</w:t>
             </w:r>
           </w:p>
         </w:tc>
@@ -2466,7 +2468,7 @@
                 <w:sz w:val="17"/>
                 <w:szCs w:val="17"/>
               </w:rPr>
-              <w:t xml:space="preserve">Zod chặn JSON sai cấu trúc từ LLM trước validator; mỗi luật validator có unit test với lịch cố ý sai; CI mỗi PR. 0 đồng</w:t>
+              <w:t xml:space="preserve">Storage của Firebase cần gói trả phí, nên ảnh bài đăng đi qua Cloudinary, Firestore chỉ lưu URL. 0 đồng, 25 credit/tháng</w:t>
             </w:r>
           </w:p>
         </w:tc>
@@ -2490,7 +2492,7 @@
                 <w:sz w:val="17"/>
                 <w:szCs w:val="17"/>
               </w:rPr>
-              <w:t xml:space="preserve">Geoapify, Wikivoyage, Wikidata, OpenTripMap; Wikipedia + Commons</w:t>
+              <w:t xml:space="preserve">Zod, Vitest, GitHub Actions</w:t>
             </w:r>
           </w:p>
         </w:tc>
@@ -2509,7 +2511,7 @@
                 <w:sz w:val="17"/>
                 <w:szCs w:val="17"/>
               </w:rPr>
-              <w:t xml:space="preserve">Nạp ứng viên, giá và giờ ban đầu, chỉ chạy trong script nạp một lần; Wikipedia và Commons cho mô tả và ảnh trang chi tiết thay cho Google Places. 0 đồng, CC BY-SA, ghi nguồn ở CP6</w:t>
+              <w:t xml:space="preserve">Zod chặn JSON sai cấu trúc từ LLM trước validator; mỗi luật validator có unit test với lịch cố ý sai; CI mỗi PR. 0 đồng</w:t>
             </w:r>
           </w:p>
         </w:tc>
@@ -2533,7 +2535,7 @@
                 <w:sz w:val="17"/>
                 <w:szCs w:val="17"/>
               </w:rPr>
-              <w:t xml:space="preserve">Valhalla (FOSSGIS), OSRM dự phòng</w:t>
+              <w:t xml:space="preserve">Geoapify, Wikivoyage, Wikidata, OpenTripMap; Wikipedia + Commons</w:t>
             </w:r>
           </w:p>
         </w:tc>
@@ -2552,7 +2554,7 @@
                 <w:sz w:val="17"/>
                 <w:szCs w:val="17"/>
               </w:rPr>
-              <w:t xml:space="preserve">Có chế độ xe máy đúng cách nhóm Linh đi; ma trận 150×150 tính trước một lần, validator tra bảng. 0 đồng; 150 lần gọi 1×150, dưới 1 lần/giây, xong trong vài phút; bị chặn thì chuyển OSRM</w:t>
+              <w:t xml:space="preserve">Nạp ứng viên, giá và giờ ban đầu, chọn 150 điểm nổi tiếng nhất, chỉ chạy trong script nạp một lần; Wikipedia và Commons cho mô tả và ảnh trang chi tiết thay cho Google Places. 0 đồng, CC BY-SA, ghi nguồn ở CP6</w:t>
             </w:r>
           </w:p>
         </w:tc>
@@ -2576,6 +2578,49 @@
                 <w:sz w:val="17"/>
                 <w:szCs w:val="17"/>
               </w:rPr>
+              <w:t xml:space="preserve">Valhalla (FOSSGIS), OSRM dự phòng</w:t>
+            </w:r>
+          </w:p>
+        </w:tc>
+        <w:tc>
+          <w:tcPr>
+            <w:tcW w:type="dxa" w:w="7582"/>
+          </w:tcPr>
+          <w:p>
+            <w:pPr>
+              <w:pStyle w:val="Compact"/>
+              <w:spacing w:after="0" w:before="0" w:line="240" w:lineRule="auto"/>
+              <w:jc w:val="left"/>
+            </w:pPr>
+            <w:r>
+              <w:rPr>
+                <w:sz w:val="17"/>
+                <w:szCs w:val="17"/>
+              </w:rPr>
+              <w:t xml:space="preserve">Có chế độ xe máy đúng cách nhóm Linh đi; ma trận 150×150 tính trước một lần, validator tra bảng. 0 đồng, dùng có chừng mực</w:t>
+            </w:r>
+          </w:p>
+        </w:tc>
+      </w:tr>
+      <w:tr>
+        <w:trPr>
+          <w:cantSplit/>
+        </w:trPr>
+        <w:tc>
+          <w:tcPr>
+            <w:tcW w:type="dxa" w:w="2804"/>
+          </w:tcPr>
+          <w:p>
+            <w:pPr>
+              <w:pStyle w:val="Compact"/>
+              <w:spacing w:after="0" w:before="0" w:line="240" w:lineRule="auto"/>
+              <w:jc w:val="left"/>
+            </w:pPr>
+            <w:r>
+              <w:rPr>
+                <w:sz w:val="17"/>
+                <w:szCs w:val="17"/>
+              </w:rPr>
               <w:t xml:space="preserve">Open-Meteo, Nager.Date; MapLibre GL JS + OpenFreeMap</w:t>
             </w:r>
           </w:p>
@@ -2605,7 +2650,6 @@
       <w:pPr>
         <w:pStyle w:val="BodyText"/>
         <w:spacing w:after="0" w:before="0" w:line="20" w:lineRule="exact"/>
-        <w:jc w:val="both"/>
         <w:rPr>
           <w:sz w:val="2"/>
           <w:szCs w:val="2"/>

</xml_diff>